<commit_message>
removed BAUA_S023 from light_glasses
</commit_message>
<xml_diff>
--- a/output/tables/table_summary.docx
+++ b/output/tables/table_summary.docx
@@ -185,7 +185,7 @@
                 <w:rFonts w:ascii="Calibri" w:hAnsi="Calibri"/>
                 <w:sz w:val="20"/>
               </w:rPr>
-              <w:t xml:space="default">&lt;strong&gt;20&lt;/strong&gt; </w:t>
+              <w:t xml:space="default">&lt;strong&gt;19&lt;/strong&gt; </w:t>
             </w:r>
           </w:p>
         </w:tc>
@@ -286,7 +286,7 @@
                 <w:rFonts w:ascii="Calibri" w:hAnsi="Calibri"/>
                 <w:sz w:val="20"/>
               </w:rPr>
-              <w:t xml:space="default">&lt;strong&gt;153&lt;/strong&gt; (1 - 8)</w:t>
+              <w:t xml:space="default">&lt;strong&gt;145&lt;/strong&gt; (1 - 8)</w:t>
             </w:r>
           </w:p>
         </w:tc>
@@ -387,7 +387,7 @@
                 <w:rFonts w:ascii="Calibri" w:hAnsi="Calibri"/>
                 <w:sz w:val="20"/>
               </w:rPr>
-              <w:t xml:space="default">&lt;strong&gt;115&lt;/strong&gt; (6 - 7)</w:t>
+              <w:t xml:space="default">&lt;strong&gt;109&lt;/strong&gt; (6 - 7)</w:t>
             </w:r>
           </w:p>
         </w:tc>
@@ -589,7 +589,7 @@
                 <w:rFonts w:ascii="Calibri" w:hAnsi="Calibri"/>
                 <w:sz w:val="20"/>
               </w:rPr>
-              <w:t xml:space="default">&lt;strong&gt;16h 31m&lt;/strong&gt; (11h 31m - 18h 13m)</w:t>
+              <w:t xml:space="default">&lt;strong&gt;16h 43m&lt;/strong&gt; (11h 31m - 18h 13m)</w:t>
             </w:r>
           </w:p>
         </w:tc>
@@ -742,7 +742,7 @@
                 <w:rFonts w:ascii="Calibri" w:hAnsi="Calibri"/>
                 <w:sz w:val="20"/>
               </w:rPr>
-              <w:t xml:space="default">&lt;strong&gt;12,325&lt;/strong&gt; ±21,523 (0 - 144,958)</w:t>
+              <w:t xml:space="default">&lt;strong&gt;13,001&lt;/strong&gt; ±21,912 (55 - 144,958)</w:t>
             </w:r>
           </w:p>
         </w:tc>
@@ -852,7 +852,7 @@
                 <w:rFonts w:ascii="Calibri" w:hAnsi="Calibri"/>
                 <w:sz w:val="20"/>
               </w:rPr>
-              <w:t xml:space="default">&lt;strong&gt;3h 42m&lt;/strong&gt; ±3h 9m (0s - 15h 29m)</w:t>
+              <w:t xml:space="default">&lt;strong&gt;3h 54m&lt;/strong&gt; ±3h 7m (0s - 15h 29m)</w:t>
             </w:r>
           </w:p>
         </w:tc>
@@ -962,7 +962,7 @@
                 <w:rFonts w:ascii="Calibri" w:hAnsi="Calibri"/>
                 <w:sz w:val="20"/>
               </w:rPr>
-              <w:t xml:space="default">&lt;strong&gt;2h 27m&lt;/strong&gt; ±1h 53m (0s - 10h 18m)</w:t>
+              <w:t xml:space="default">&lt;strong&gt;2h 35m&lt;/strong&gt; ±1h 51m (7m 10s - 10h 18m)</w:t>
             </w:r>
           </w:p>
         </w:tc>
@@ -1072,7 +1072,7 @@
                 <w:rFonts w:ascii="Calibri" w:hAnsi="Calibri"/>
                 <w:sz w:val="20"/>
               </w:rPr>
-              <w:t xml:space="default">&lt;strong&gt;10h 19m&lt;/strong&gt; ±3h 54m (4h 51m - 1d)</w:t>
+              <w:t xml:space="default">&lt;strong&gt;9h 35m&lt;/strong&gt; ±2h 23m (4h 51m - 18h 28m)</w:t>
             </w:r>
           </w:p>
         </w:tc>
@@ -1182,7 +1182,7 @@
                 <w:rFonts w:ascii="Calibri" w:hAnsi="Calibri"/>
                 <w:sz w:val="20"/>
               </w:rPr>
-              <w:t xml:space="default">&lt;strong&gt;56m 57s&lt;/strong&gt; ±1h 13m (0s - 6h 44m)</w:t>
+              <w:t xml:space="default">&lt;strong&gt;59m 57s&lt;/strong&gt; ±1h 13m (0s - 6h 44m)</w:t>
             </w:r>
           </w:p>
         </w:tc>
@@ -1292,7 +1292,7 @@
                 <w:rFonts w:ascii="Calibri" w:hAnsi="Calibri"/>
                 <w:sz w:val="20"/>
               </w:rPr>
-              <w:t xml:space="default">&lt;strong&gt;1h 37m&lt;/strong&gt; ±2h 9m (0s - 14h 4m)</w:t>
+              <w:t xml:space="default">&lt;strong&gt;1h 42m&lt;/strong&gt; ±2h 11m (0s - 14h 4m)</w:t>
             </w:r>
           </w:p>
         </w:tc>
@@ -1402,7 +1402,7 @@
                 <w:rFonts w:ascii="Calibri" w:hAnsi="Calibri"/>
                 <w:sz w:val="20"/>
               </w:rPr>
-              <w:t xml:space="default">&lt;strong&gt;08:50&lt;/strong&gt; ±02:25 (00:43 - 16:49)</w:t>
+              <w:t xml:space="default">&lt;strong&gt;08:51&lt;/strong&gt; ±02:26 (00:43 - 16:49)</w:t>
             </w:r>
           </w:p>
         </w:tc>
@@ -1521,7 +1521,7 @@
                 <w:rFonts w:ascii="Calibri" w:hAnsi="Calibri"/>
                 <w:sz w:val="20"/>
               </w:rPr>
-              <w:t xml:space="default">&lt;strong&gt;13:51&lt;/strong&gt; ±01:52 (09:17 - 19:35)</w:t>
+              <w:t xml:space="default">&lt;strong&gt;13:54&lt;/strong&gt; ±01:50 (10:04 - 19:35)</w:t>
             </w:r>
           </w:p>
         </w:tc>
@@ -1640,7 +1640,7 @@
                 <w:rFonts w:ascii="Calibri" w:hAnsi="Calibri"/>
                 <w:sz w:val="20"/>
               </w:rPr>
-              <w:t xml:space="default">&lt;strong&gt;19:27&lt;/strong&gt; ±02:17 (10:40 - 22:56)</w:t>
+              <w:t xml:space="default">&lt;strong&gt;19:30&lt;/strong&gt; ±02:13 (10:40 - 22:56)</w:t>
             </w:r>
           </w:p>
         </w:tc>
@@ -1759,7 +1759,7 @@
                 <w:rFonts w:ascii="Calibri" w:hAnsi="Calibri"/>
                 <w:sz w:val="20"/>
               </w:rPr>
-              <w:t xml:space="default">&lt;strong&gt;13:24&lt;/strong&gt; ±02:34 (04:59 - 18:59)</w:t>
+              <w:t xml:space="default">&lt;strong&gt;13:49&lt;/strong&gt; ±01:51 (08:51 - 18:59)</w:t>
             </w:r>
           </w:p>
         </w:tc>
@@ -1878,7 +1878,7 @@
                 <w:rFonts w:ascii="Calibri" w:hAnsi="Calibri"/>
                 <w:sz w:val="20"/>
               </w:rPr>
-              <w:t xml:space="default">&lt;strong&gt;03:01&lt;/strong&gt; ±02:55 (00:18 - 23:32)</w:t>
+              <w:t xml:space="default">&lt;strong&gt;03:03&lt;/strong&gt; ±03:00 (00:18 - 23:32)</w:t>
             </w:r>
           </w:p>
         </w:tc>
@@ -2013,7 +2013,7 @@
                 <w:rFonts w:ascii="Calibri" w:hAnsi="Calibri"/>
                 <w:sz w:val="20"/>
               </w:rPr>
-              <w:t xml:space="default">&lt;strong&gt;320.2&lt;/strong&gt; ±1,032.6 (0.0 - 9,111.6)</w:t>
+              <w:t xml:space="default">&lt;strong&gt;337.8&lt;/strong&gt; ±1,058.1 (2.1 - 9,111.6)</w:t>
             </w:r>
           </w:p>
         </w:tc>
@@ -2240,7 +2240,7 @@
                 <w:rFonts w:ascii="Calibri" w:hAnsi="Calibri"/>
                 <w:sz w:val="20"/>
               </w:rPr>
-              <w:t xml:space="default">&lt;strong&gt;0.264&lt;/strong&gt; ±0.078 (0.158 - 0.414)</w:t>
+              <w:t xml:space="default">&lt;strong&gt;0.270&lt;/strong&gt; ±0.076 (0.177 - 0.414)</w:t>
             </w:r>
           </w:p>
         </w:tc>
@@ -2341,7 +2341,7 @@
                 <w:rFonts w:ascii="Calibri" w:hAnsi="Calibri"/>
                 <w:sz w:val="20"/>
               </w:rPr>
-              <w:t xml:space="default">&lt;strong&gt;1.335&lt;/strong&gt; ±0.414 (0.415 - 1.814)</w:t>
+              <w:t xml:space="default">&lt;strong&gt;1.310&lt;/strong&gt; ±0.411 (0.415 - 1.814)</w:t>
             </w:r>
           </w:p>
         </w:tc>
@@ -2452,7 +2452,7 @@
                 <w:rFonts w:ascii="Calibri" w:hAnsi="Calibri"/>
                 <w:sz w:val="20"/>
               </w:rPr>
-              <w:t xml:space="default">Metrics are calculated on a by-participant-day basis (n=115) with the exception of IV and IS, which are calculated on a by-participant basis (n=20).</w:t>
+              <w:t xml:space="default">Metrics are calculated on a by-participant-day basis (n=109) with the exception of IV and IS, which are calculated on a by-participant basis (n=19).</w:t>
             </w:r>
           </w:p>
         </w:tc>

</xml_diff>